<commit_message>
Umbenennung CRSF-Multiswitch -> RC-Multiswitch
Neutraler Name, weil der Multiswitch neben CRSF auch SBUS versteht.
README, docs (MD und DOCX), KiCad-Projekt (Dateinamen, Projekt- und
Sheet-Verweise, Titel), Sketch-Ordner und CI-Pfad angepasst.
Geraetename, WLAN-SSID und Config-Export bleiben "MultiSwitch".

Co-Authored-By: Claude Opus 5.5 (1M context) <noreply@anthropic.com>
Claude-Session: https://claude.ai/code/session_01Np9GkYmRMGJmd89YiKPa21
</commit_message>
<xml_diff>
--- a/docs/Firmware-Spezifikation.docx
+++ b/docs/Firmware-Spezifikation.docx
@@ -7,7 +7,7 @@
         <w:pStyle w:val="Title"/>
       </w:pPr>
       <w:r>
-        <w:t xml:space="preserve">CRSF-Multiswitch – Firmware-Spezifikation</w:t>
+        <w:t>RC-Multiswitch – Firmware-Spezifikation</w:t>
       </w:r>
     </w:p>
     <w:p>
@@ -4829,6 +4829,9 @@
     </w:p>
     <w:sectPr>
       <w:footerReference w:type="default" r:id="rId7"/>
+      <w:headerReference w:type="default" r:id="rId9"/>
+      <w:headerReference w:type="first" r:id="rId10"/>
+      <w:footerReference w:type="first" r:id="rId11"/>
       <w:pgSz w:w="11906" w:h="16838" w:orient="portrait"/>
       <w:pgMar w:top="1134" w:right="1134" w:bottom="1134" w:left="1134" w:header="708" w:footer="708" w:gutter="0"/>
       <w:pgNumType/>
@@ -4891,7 +4894,7 @@
         <w:sz w:val="16"/>
         <w:szCs w:val="16"/>
       </w:rPr>
-      <w:t xml:space="preserve">CRSF-Multiswitch – Firmware-Spezifikation – Seite </w:t>
+      <w:t xml:space="preserve">RC-Multiswitch – Firmware-Spezifikation – Seite </w:t>
     </w:r>
     <w:r>
       <w:rPr>
@@ -4908,6 +4911,16 @@
 </w:ftr>
 </file>
 
+<file path=word/footer2.xml><?xml version="1.0" encoding="utf-8"?>
+<w:ftr xmlns:m="http://schemas.openxmlformats.org/officeDocument/2006/math" xmlns:mc="http://schemas.openxmlformats.org/markup-compatibility/2006" xmlns:mo="http://schemas.microsoft.com/office/mac/office/2008/main" xmlns:mv="urn:schemas-microsoft-com:mac:vml" xmlns:o="urn:schemas-microsoft-com:office:office" xmlns:r="http://schemas.openxmlformats.org/officeDocument/2006/relationships" xmlns:v="urn:schemas-microsoft-com:vml" xmlns:w10="urn:schemas-microsoft-com:office:word" xmlns:w14="http://schemas.microsoft.com/office/word/2010/wordml" xmlns:w="http://schemas.openxmlformats.org/wordprocessingml/2006/main" xmlns:wne="http://schemas.microsoft.com/office/word/2006/wordml" xmlns:wp14="http://schemas.microsoft.com/office/word/2010/wordprocessingDrawing" xmlns:wp="http://schemas.openxmlformats.org/drawingml/2006/wordprocessingDrawing" xmlns:wpc="http://schemas.microsoft.com/office/word/2010/wordprocessingCanvas" xmlns:wpg="http://schemas.microsoft.com/office/word/2010/wordprocessingGroup" xmlns:wpi="http://schemas.microsoft.com/office/word/2010/wordprocessingInk" xmlns:wps="http://schemas.microsoft.com/office/word/2010/wordprocessingShape" mc:Ignorable="w14 wp14">
+  <w:p>
+    <w:pPr>
+      <w:pStyle w:val="Footer"/>
+    </w:pPr>
+  </w:p>
+</w:ftr>
+</file>
+
 <file path=word/footnotes.xml><?xml version="1.0" encoding="utf-8"?>
 <w:footnotes xmlns:wpc="http://schemas.microsoft.com/office/word/2010/wordprocessingCanvas" xmlns:mc="http://schemas.openxmlformats.org/markup-compatibility/2006" xmlns:o="urn:schemas-microsoft-com:office:office" xmlns:r="http://schemas.openxmlformats.org/officeDocument/2006/relationships" xmlns:m="http://schemas.openxmlformats.org/officeDocument/2006/math" xmlns:v="urn:schemas-microsoft-com:vml" xmlns:wp14="http://schemas.microsoft.com/office/word/2010/wordprocessingDrawing" xmlns:wp="http://schemas.openxmlformats.org/drawingml/2006/wordprocessingDrawing" xmlns:w10="urn:schemas-microsoft-com:office:word" xmlns:w="http://schemas.openxmlformats.org/wordprocessingml/2006/main" xmlns:w14="http://schemas.microsoft.com/office/word/2010/wordml" xmlns:w15="http://schemas.microsoft.com/office/word/2012/wordml" xmlns:wpg="http://schemas.microsoft.com/office/word/2010/wordprocessingGroup" xmlns:wpi="http://schemas.microsoft.com/office/word/2010/wordprocessingInk" xmlns:wne="http://schemas.microsoft.com/office/word/2006/wordml" xmlns:wps="http://schemas.microsoft.com/office/word/2010/wordprocessingShape" mc:Ignorable="w14 w15 wp14">
   <w:footnote w:type="separator" w:id="-1">
@@ -4943,6 +4956,26 @@
     </w:p>
   </w:footnote>
 </w:footnotes>
+</file>
+
+<file path=word/header1.xml><?xml version="1.0" encoding="utf-8"?>
+<w:hdr xmlns:m="http://schemas.openxmlformats.org/officeDocument/2006/math" xmlns:mc="http://schemas.openxmlformats.org/markup-compatibility/2006" xmlns:mo="http://schemas.microsoft.com/office/mac/office/2008/main" xmlns:mv="urn:schemas-microsoft-com:mac:vml" xmlns:o="urn:schemas-microsoft-com:office:office" xmlns:r="http://schemas.openxmlformats.org/officeDocument/2006/relationships" xmlns:v="urn:schemas-microsoft-com:vml" xmlns:w10="urn:schemas-microsoft-com:office:word" xmlns:w14="http://schemas.microsoft.com/office/word/2010/wordml" xmlns:w="http://schemas.openxmlformats.org/wordprocessingml/2006/main" xmlns:wne="http://schemas.microsoft.com/office/word/2006/wordml" xmlns:wp14="http://schemas.microsoft.com/office/word/2010/wordprocessingDrawing" xmlns:wp="http://schemas.openxmlformats.org/drawingml/2006/wordprocessingDrawing" xmlns:wpc="http://schemas.microsoft.com/office/word/2010/wordprocessingCanvas" xmlns:wpg="http://schemas.microsoft.com/office/word/2010/wordprocessingGroup" xmlns:wpi="http://schemas.microsoft.com/office/word/2010/wordprocessingInk" xmlns:wps="http://schemas.microsoft.com/office/word/2010/wordprocessingShape" mc:Ignorable="w14 wp14">
+  <w:p>
+    <w:pPr>
+      <w:pStyle w:val="Header"/>
+    </w:pPr>
+  </w:p>
+</w:hdr>
+</file>
+
+<file path=word/header2.xml><?xml version="1.0" encoding="utf-8"?>
+<w:hdr xmlns:m="http://schemas.openxmlformats.org/officeDocument/2006/math" xmlns:mc="http://schemas.openxmlformats.org/markup-compatibility/2006" xmlns:mo="http://schemas.microsoft.com/office/mac/office/2008/main" xmlns:mv="urn:schemas-microsoft-com:mac:vml" xmlns:o="urn:schemas-microsoft-com:office:office" xmlns:r="http://schemas.openxmlformats.org/officeDocument/2006/relationships" xmlns:v="urn:schemas-microsoft-com:vml" xmlns:w10="urn:schemas-microsoft-com:office:word" xmlns:w14="http://schemas.microsoft.com/office/word/2010/wordml" xmlns:w="http://schemas.openxmlformats.org/wordprocessingml/2006/main" xmlns:wne="http://schemas.microsoft.com/office/word/2006/wordml" xmlns:wp14="http://schemas.microsoft.com/office/word/2010/wordprocessingDrawing" xmlns:wp="http://schemas.openxmlformats.org/drawingml/2006/wordprocessingDrawing" xmlns:wpc="http://schemas.microsoft.com/office/word/2010/wordprocessingCanvas" xmlns:wpg="http://schemas.microsoft.com/office/word/2010/wordprocessingGroup" xmlns:wpi="http://schemas.microsoft.com/office/word/2010/wordprocessingInk" xmlns:wps="http://schemas.microsoft.com/office/word/2010/wordprocessingShape" mc:Ignorable="w14 wp14">
+  <w:p>
+    <w:pPr>
+      <w:pStyle w:val="Header"/>
+    </w:pPr>
+  </w:p>
+</w:hdr>
 </file>
 
 <file path=word/numbering.xml><?xml version="1.0" encoding="utf-8"?>

</xml_diff>